<commit_message>
Standardize DOCX and XLSX templates on Carbone-style syntax
</commit_message>
<xml_diff>
--- a/corpus/docx/level-001/template.docx
+++ b/corpus/docx/level-001/template.docx
@@ -12,32 +12,32 @@
     </w:p>
     <w:p>
       <w:r>
-        <w:t xml:space="preserve">{{title}}</w:t>
+        <w:t xml:space="preserve">{d.title}</w:t>
       </w:r>
     </w:p>
     <w:p>
       <w:r>
-        <w:t xml:space="preserve">{{customer}}</w:t>
+        <w:t xml:space="preserve">{d.customer}</w:t>
       </w:r>
     </w:p>
     <w:p>
       <w:r>
-        <w:t xml:space="preserve">{{spaced}}</w:t>
+        <w:t xml:space="preserve">{d.spaced}</w:t>
       </w:r>
     </w:p>
     <w:p>
       <w:r>
-        <w:t xml:space="preserve">{{literal}}</w:t>
+        <w:t xml:space="preserve">{d.literal}</w:t>
       </w:r>
     </w:p>
     <w:p>
       <w:r>
-        <w:t xml:space="preserve">{{count}}</w:t>
+        <w:t xml:space="preserve">{d.count}</w:t>
       </w:r>
     </w:p>
     <w:p>
       <w:r>
-        <w:t xml:space="preserve">{{enabled}}</w:t>
+        <w:t xml:space="preserve">{d.enabled}</w:t>
       </w:r>
     </w:p>
     <w:sectPr>

</xml_diff>